<commit_message>
Case study, full package and cover: precise claims, limitations
Match the README wording: AI governance prototype in a fictional
clinic, call 911 first in the tested emergency scenario, configured
refusals, Microsoft 365 Copilot channel check. Add an independent-
project line and Known limitations. Repaint the cover subtitle and
re-export both PDFs from Word.
</commit_message>
<xml_diff>
--- a/CASE_STUDY.docx
+++ b/CASE_STUDY.docx
@@ -52,7 +52,7 @@
         <w:rPr>
           <w:i/>
         </w:rPr>
-        <w:t>A governed AI agent for a regulated environment, built in Microsoft Copilot Studio.</w:t>
+        <w:t>An AI governance prototype in a fictional clinic setting, built in Microsoft Copilot Studio.</w:t>
       </w:r>
     </w:p>
     <w:p>
@@ -60,7 +60,7 @@
         <w:rPr>
           <w:i/>
         </w:rPr>
-        <w:t>All clinic data and scenarios are fictional, for demonstration only. All evaluation results are real.</w:t>
+        <w:t>An independent portfolio project, built outside my employment. All clinic data and scenarios are fictional, for demonstration only. All evaluation results are real.</w:t>
       </w:r>
     </w:p>
     <w:p>
@@ -85,13 +85,13 @@
       </w:r>
       <w:r>
         <w:rPr/>
-        <w:t xml:space="preserve"> to answer. It declines medical and medication questions, sends possible emergencies to 911 in its first sentence, never reveals or confirms another patient's information, and says plainly when something isn't in its documents.</w:t>
+        <w:t xml:space="preserve"> to answer. It declines medical and medication questions, puts "call 911" first in the tested emergency scenario, is configured to refuse requests for another patient's information, and says plainly when something isn't in its documents.</w:t>
       </w:r>
     </w:p>
     <w:p>
       <w:r>
         <w:rPr/>
-        <w:t xml:space="preserve">What sets this project apart is how it was proven. Rather than demoing a few good answers, I built a 12-case evaluation set, half of it designed to make the agent fail, and ran it four times. The first run exposed a flaw in the </w:t>
+        <w:t xml:space="preserve">What sets this project apart is how it was tested. Rather than demoing a few good answers, I built a 12-case evaluation set, half of it designed to make the agent fail, and ran it four times. The first run exposed a flaw in the </w:t>
       </w:r>
       <w:r>
         <w:rPr>
@@ -1104,7 +1104,7 @@
       </w:r>
       <w:r>
         <w:rPr/>
-        <w:t xml:space="preserve"> in the production channel.</w:t>
+        <w:t xml:space="preserve"> in the Microsoft 365 Copilot channel.</w:t>
       </w:r>
     </w:p>
     <w:p>
@@ -1241,7 +1241,7 @@
       </w:r>
       <w:r>
         <w:rPr/>
-        <w:t xml:space="preserve"> "Call 911 now" leads any possible-emergency response.</w:t>
+        <w:t xml:space="preserve"> "Call 911 now" leads the response in the tested emergency scenario, guided by instructions rather than a fixed topic.</w:t>
       </w:r>
     </w:p>
     <w:p>
@@ -1299,6 +1299,90 @@
       <w:r>
         <w:rPr/>
         <w:t>.</w:t>
+      </w:r>
+    </w:p>
+    <w:p>
+      <w:pPr>
+        <w:pStyle w:val="Heading2"/>
+      </w:pPr>
+      <w:r>
+        <w:rPr/>
+        <w:t>Known limitations</w:t>
+      </w:r>
+    </w:p>
+    <w:p>
+      <w:pPr>
+        <w:pStyle w:val="ListBullet"/>
+      </w:pPr>
+      <w:r>
+        <w:rPr>
+          <w:b/>
+        </w:rPr>
+        <w:t>A prototype, not a clinical system.</w:t>
+      </w:r>
+      <w:r>
+        <w:rPr/>
+        <w:t xml:space="preserve"> Four short fictional policy documents; never used with real patients or real clinical content.</w:t>
+      </w:r>
+    </w:p>
+    <w:p>
+      <w:pPr>
+        <w:pStyle w:val="ListBullet"/>
+      </w:pPr>
+      <w:r>
+        <w:rPr>
+          <w:b/>
+        </w:rPr>
+        <w:t>Fixed, single-turn test set.</w:t>
+      </w:r>
+      <w:r>
+        <w:rPr/>
+        <w:t xml:space="preserve"> 12 cases describe behaviour on those prompts only and do not establish reliability across all possible requests. Multi-turn conversations were not evaluated.</w:t>
+      </w:r>
+    </w:p>
+    <w:p>
+      <w:pPr>
+        <w:pStyle w:val="ListBullet"/>
+      </w:pPr>
+      <w:r>
+        <w:rPr>
+          <w:b/>
+        </w:rPr>
+        <w:t>Emergency handling is instruction-based,</w:t>
+      </w:r>
+      <w:r>
+        <w:rPr/>
+        <w:t xml:space="preserve"> so wording can vary; a deterministic emergency topic is the next step.</w:t>
+      </w:r>
+    </w:p>
+    <w:p>
+      <w:pPr>
+        <w:pStyle w:val="ListBullet"/>
+      </w:pPr>
+      <w:r>
+        <w:rPr>
+          <w:b/>
+        </w:rPr>
+        <w:t>The custom grader is my own.</w:t>
+      </w:r>
+      <w:r>
+        <w:rPr/>
+        <w:t xml:space="preserve"> It is published verbatim in EVALUATION.md so anyone can judge it.</w:t>
+      </w:r>
+    </w:p>
+    <w:p>
+      <w:pPr>
+        <w:pStyle w:val="ListBullet"/>
+      </w:pPr>
+      <w:r>
+        <w:rPr>
+          <w:b/>
+        </w:rPr>
+        <w:t>Runs only inside one development tenant,</w:t>
+      </w:r>
+      <w:r>
+        <w:rPr/>
+        <w:t xml:space="preserve"> behind Entra sign-in; there is no public demo link by design.</w:t>
       </w:r>
     </w:p>
     <w:p>
@@ -1369,7 +1453,7 @@
     <w:p>
       <w:r>
         <w:rPr/>
-        <w:t>This project shows responsible AI as a working practice rather than a slogan: guardrails written into the design, an evaluation built to break them, the judgment to notice when a default metric is misleading, and the discipline to change one thing at a time and prove the result. The same pattern applies anywhere a wrong answer carries risk: HR, finance, compliance, operations.</w:t>
+        <w:t>This project shows responsible AI as a working practice rather than a slogan: guardrails written into the design, an evaluation built to break them, the judgment to notice when a default metric is misleading, and the discipline to change one thing at a time and measure the result. The same pattern applies anywhere a wrong answer carries risk: HR, finance, compliance, operations.</w:t>
       </w:r>
     </w:p>
     <w:p>

</xml_diff>